<commit_message>
Remove horizontal rules and placeholder dashes from agreement
Co-Authored-By: Claude Sonnet 5.5 <noreply@anthropic.com>
Claude-Session: https://claude.ai/code/session_0174JTME3oPaxbTSKzKtjdrq
</commit_message>
<xml_diff>
--- a/kenzai-search-agreement.docx
+++ b/kenzai-search-agreement.docx
@@ -18,13 +18,6 @@
       </w:pPr>
       <w:r>
         <w:t xml:space="preserve">積水樹脂株式会社（以下「甲」という。）と株式会社Archi Village（以下「乙」という。）は、建材商品情報の総合プラットフォームとして、設計事務所や代理店等のセレクターによる商品選定を容易にし、メーカーの販売促進に資することを目的とするクラウドサービス「建材サーチ」の利用等に関して、次のとおり合意し、この「建材サーチ」利用契約（以下「本契約」という。）を締結する。</w:t>
-      </w:r>
-    </w:p>
-    <w:p>
-      <w:r>
-        <w:pict>
-          <v:rect style="width:0;height:1.5pt" o:hralign="center" o:hrstd="t" o:hr="t"/>
-        </w:pict>
       </w:r>
     </w:p>
     <w:bookmarkStart w:id="23" w:name="第1章-総-則"/>
@@ -187,13 +180,6 @@
       </w:pPr>
       <w:r>
         <w:t xml:space="preserve">　(10)　「著作権」とは、日本を含む全世界における、著作権法上の全ての権利（著作権法第27条及び第28条所定の各権利を含み、これらに限られない。）並びに、商品、製品等に関する著作権、商標権、意匠権、所有権及びデータ利用権を含むものとする。</w:t>
-      </w:r>
-    </w:p>
-    <w:p>
-      <w:r>
-        <w:pict>
-          <v:rect style="width:0;height:1.5pt" o:hralign="center" o:hrstd="t" o:hr="t"/>
-        </w:pict>
       </w:r>
     </w:p>
     <w:bookmarkEnd w:id="22"/>
@@ -568,14 +554,7 @@
           <w:p>
             <w:pPr>
               <w:pStyle w:val="Compact"/>
-              <w:jc w:val="left"/>
             </w:pPr>
-            <w:r>
-              <w:rPr>
-                <w:sz w:val="19"/>
-              </w:rPr>
-              <w:t xml:space="preserve">—</w:t>
-            </w:r>
           </w:p>
         </w:tc>
       </w:tr>
@@ -905,14 +884,7 @@
           <w:p>
             <w:pPr>
               <w:pStyle w:val="Compact"/>
-              <w:jc w:val="left"/>
             </w:pPr>
-            <w:r>
-              <w:rPr>
-                <w:sz w:val="19"/>
-              </w:rPr>
-              <w:t xml:space="preserve">—</w:t>
-            </w:r>
           </w:p>
         </w:tc>
       </w:tr>
@@ -978,14 +950,7 @@
           <w:p>
             <w:pPr>
               <w:pStyle w:val="Compact"/>
-              <w:jc w:val="left"/>
             </w:pPr>
-            <w:r>
-              <w:rPr>
-                <w:sz w:val="19"/>
-              </w:rPr>
-              <w:t xml:space="preserve">—</w:t>
-            </w:r>
           </w:p>
         </w:tc>
       </w:tr>
@@ -1051,14 +1016,7 @@
           <w:p>
             <w:pPr>
               <w:pStyle w:val="Compact"/>
-              <w:jc w:val="left"/>
             </w:pPr>
-            <w:r>
-              <w:rPr>
-                <w:sz w:val="19"/>
-              </w:rPr>
-              <w:t xml:space="preserve">—</w:t>
-            </w:r>
           </w:p>
         </w:tc>
       </w:tr>
@@ -1405,13 +1363,6 @@
         <w:t xml:space="preserve">本件サービスの全部又は一部が停止し、乙が甲に対し、その再開のために必要な協力を求めた場合、甲は、速やかにこれに応じるものとする。</w:t>
       </w:r>
     </w:p>
-    <w:p>
-      <w:r>
-        <w:pict>
-          <v:rect style="width:0;height:1.5pt" o:hralign="center" o:hrstd="t" o:hr="t"/>
-        </w:pict>
-      </w:r>
-    </w:p>
     <w:bookmarkEnd w:id="33"/>
     <w:bookmarkEnd w:id="34"/>
     <w:bookmarkStart w:id="38" w:name="第3章-料-金"/>
@@ -1524,13 +1475,6 @@
         <w:t xml:space="preserve">2　本件サービス料金が暦月の途中で変更された場合、変更後の本件サービス料金は、翌月の初日から適用する。</w:t>
       </w:r>
     </w:p>
-    <w:p>
-      <w:r>
-        <w:pict>
-          <v:rect style="width:0;height:1.5pt" o:hralign="center" o:hrstd="t" o:hr="t"/>
-        </w:pict>
-      </w:r>
-    </w:p>
     <w:bookmarkEnd w:id="37"/>
     <w:bookmarkEnd w:id="38"/>
     <w:bookmarkStart w:id="46" w:name="第4章-サービスの停止及び責任"/>
@@ -1963,13 +1907,6 @@
         <w:t xml:space="preserve">7　甲及び乙は、本条に定める損害賠償責任の上限及び免責の範囲が、本件サービスの月額の本件サービス料金及び初期費用等の対価の額、本件サービスの提供形態並びに乙が管理可能なリスクの範囲との不均衡を回避し、現在の料金体系でサービスを維持・継続するために不可欠な合意内容であることを確認し、これに同意する。</w:t>
       </w:r>
     </w:p>
-    <w:p>
-      <w:r>
-        <w:pict>
-          <v:rect style="width:0;height:1.5pt" o:hralign="center" o:hrstd="t" o:hr="t"/>
-        </w:pict>
-      </w:r>
-    </w:p>
     <w:bookmarkEnd w:id="45"/>
     <w:bookmarkEnd w:id="46"/>
     <w:bookmarkStart w:id="51" w:name="第5章-契約期間及び契約の終了"/>
@@ -2204,13 +2141,6 @@
         <w:t xml:space="preserve">本契約が終了した時点で未払の本件サービス料金等その他の料金がある場合、甲は、直ちに当該料金等を支払うものとする。ただし、別途合意した場合は、この限りでない。</w:t>
       </w:r>
     </w:p>
-    <w:p>
-      <w:r>
-        <w:pict>
-          <v:rect style="width:0;height:1.5pt" o:hralign="center" o:hrstd="t" o:hr="t"/>
-        </w:pict>
-      </w:r>
-    </w:p>
     <w:bookmarkEnd w:id="50"/>
     <w:bookmarkEnd w:id="51"/>
     <w:bookmarkStart w:id="59" w:name="第6章-一般条項"/>
@@ -2364,15 +2294,8 @@
       </w:r>
     </w:p>
     <w:p>
-      <w:r>
-        <w:pict>
-          <v:rect style="width:0;height:1.5pt" o:hralign="center" o:hrstd="t" o:hr="t"/>
-        </w:pict>
-      </w:r>
-    </w:p>
-    <w:p>
-      <w:pPr>
-        <w:pStyle w:val="FirstParagraph"/>
+      <w:pPr>
+        <w:pStyle w:val="BodyText"/>
       </w:pPr>
       <w:r>
         <w:t xml:space="preserve">本契約の締結を証するため、本書2通を作成し、甲乙記名押印の上、各1通を保有する。</w:t>

</xml_diff>

<commit_message>
Remove keep-with-next paragraph flags from Word version
Co-Authored-By: Claude Sonnet 5.5 <noreply@anthropic.com>
Claude-Session: https://claude.ai/code/session_0174JTME3oPaxbTSKzKtjdrq
</commit_message>
<xml_diff>
--- a/kenzai-search-agreement.docx
+++ b/kenzai-search-agreement.docx
@@ -2592,8 +2592,6 @@
     <w:next w:val="BodyText"/>
     <w:qFormat/>
     <w:pPr>
-      <w:keepNext/>
-      <w:keepLines/>
       <w:spacing w:after="240" w:before="480"/>
       <w:jc w:val="center"/>
     </w:pPr>
@@ -2612,8 +2610,6 @@
     <w:next w:val="BodyText"/>
     <w:qFormat/>
     <w:pPr>
-      <w:keepNext/>
-      <w:keepLines/>
       <w:spacing w:after="240" w:before="240"/>
       <w:jc w:val="center"/>
     </w:pPr>
@@ -2629,8 +2625,6 @@
     <w:next w:val="BodyText"/>
     <w:qFormat/>
     <w:pPr>
-      <w:keepNext/>
-      <w:keepLines/>
       <w:jc w:val="center"/>
     </w:pPr>
     <w:rPr>
@@ -2643,8 +2637,6 @@
     <w:next w:val="BodyText"/>
     <w:qFormat/>
     <w:pPr>
-      <w:keepNext/>
-      <w:keepLines/>
       <w:jc w:val="center"/>
     </w:pPr>
     <w:rPr>
@@ -2658,8 +2650,6 @@
     <w:next w:val="Abstract"/>
     <w:qFormat/>
     <w:pPr>
-      <w:keepNext/>
-      <w:keepLines/>
       <w:jc w:val="center"/>
       <w:spacing w:after="0" w:before="300"/>
     </w:pPr>
@@ -2677,8 +2667,6 @@
     <w:next w:val="BodyText"/>
     <w:qFormat/>
     <w:pPr>
-      <w:keepNext/>
-      <w:keepLines/>
       <w:spacing w:after="300" w:before="100"/>
     </w:pPr>
     <w:rPr>
@@ -2706,8 +2694,6 @@
     <w:uiPriority w:val="9"/>
     <w:qFormat/>
     <w:pPr>
-      <w:keepNext/>
-      <w:keepLines/>
       <w:spacing w:after="0" w:before="480"/>
       <w:outlineLvl w:val="0"/>
     </w:pPr>
@@ -2728,8 +2714,6 @@
     <w:unhideWhenUsed/>
     <w:qFormat/>
     <w:pPr>
-      <w:keepNext/>
-      <w:keepLines/>
       <w:spacing w:after="120" w:before="280"/>
       <w:jc w:val="center"/>
       <w:outlineLvl w:val="1"/>
@@ -2751,8 +2735,6 @@
     <w:unhideWhenUsed/>
     <w:qFormat/>
     <w:pPr>
-      <w:keepNext/>
-      <w:keepLines/>
       <w:spacing w:after="120" w:before="280"/>
       <w:outlineLvl w:val="2"/>
     </w:pPr>
@@ -2773,8 +2755,6 @@
     <w:unhideWhenUsed/>
     <w:qFormat/>
     <w:pPr>
-      <w:keepNext/>
-      <w:keepLines/>
       <w:spacing w:after="0" w:before="200"/>
       <w:outlineLvl w:val="3"/>
     </w:pPr>
@@ -2795,8 +2775,6 @@
     <w:unhideWhenUsed/>
     <w:qFormat/>
     <w:pPr>
-      <w:keepNext/>
-      <w:keepLines/>
       <w:spacing w:after="0" w:before="200"/>
       <w:outlineLvl w:val="4"/>
     </w:pPr>
@@ -2816,8 +2794,6 @@
     <w:unhideWhenUsed/>
     <w:qFormat/>
     <w:pPr>
-      <w:keepNext/>
-      <w:keepLines/>
       <w:spacing w:after="0" w:before="200"/>
       <w:outlineLvl w:val="5"/>
     </w:pPr>
@@ -2836,8 +2812,6 @@
     <w:unhideWhenUsed/>
     <w:qFormat/>
     <w:pPr>
-      <w:keepNext/>
-      <w:keepLines/>
       <w:spacing w:after="0" w:before="200"/>
       <w:outlineLvl w:val="6"/>
     </w:pPr>
@@ -2856,8 +2830,6 @@
     <w:unhideWhenUsed/>
     <w:qFormat/>
     <w:pPr>
-      <w:keepNext/>
-      <w:keepLines/>
       <w:spacing w:after="0" w:before="200"/>
       <w:outlineLvl w:val="7"/>
     </w:pPr>
@@ -2876,8 +2848,6 @@
     <w:unhideWhenUsed/>
     <w:qFormat/>
     <w:pPr>
-      <w:keepNext/>
-      <w:keepLines/>
       <w:spacing w:after="0" w:before="200"/>
       <w:outlineLvl w:val="8"/>
     </w:pPr>
@@ -2957,8 +2927,6 @@
     <w:basedOn w:val="Normal"/>
     <w:next w:val="Definition"/>
     <w:pPr>
-      <w:keepNext/>
-      <w:keepLines/>
       <w:spacing w:after="0"/>
     </w:pPr>
     <w:rPr>
@@ -2991,9 +2959,7 @@
   <w:style w:customStyle="1" w:styleId="TableCaption" w:type="paragraph">
     <w:name w:val="Table Caption"/>
     <w:basedOn w:val="Caption"/>
-    <w:pPr>
-      <w:keepNext/>
-    </w:pPr>
+    <w:pPr/>
     <w:rPr>
       <w:rFonts w:ascii="游明朝" w:hAnsi="游明朝" w:eastAsia="游明朝" w:cs="游明朝"/>
       <w:color w:val="000000"/>
@@ -3018,9 +2984,7 @@
   <w:style w:customStyle="1" w:styleId="CaptionedFigure" w:type="paragraph">
     <w:name w:val="Captioned Figure"/>
     <w:basedOn w:val="Figure"/>
-    <w:pPr>
-      <w:keepNext/>
-    </w:pPr>
+    <w:pPr/>
     <w:rPr>
       <w:rFonts w:ascii="游明朝" w:hAnsi="游明朝" w:eastAsia="游明朝" w:cs="游明朝"/>
       <w:color w:val="000000"/>

</xml_diff>

<commit_message>
Remove table borders from Word version
Co-Authored-By: Claude Sonnet 5.5 <noreply@anthropic.com>
Claude-Session: https://claude.ai/code/session_0174JTME3oPaxbTSKzKtjdrq
</commit_message>
<xml_diff>
--- a/kenzai-search-agreement.docx
+++ b/kenzai-search-agreement.docx
@@ -242,12 +242,12 @@
         <w:tblLook w:firstRow="1" w:lastRow="0" w:firstColumn="0" w:lastColumn="0" w:noHBand="0" w:noVBand="0" w:val="0020"/>
         <w:jc w:val="start"/>
         <w:tblBorders>
-          <w:top w:val="single" w:sz="4" w:color="000000"/>
-          <w:left w:val="single" w:sz="4" w:color="000000"/>
-          <w:bottom w:val="single" w:sz="4" w:color="000000"/>
-          <w:right w:val="single" w:sz="4" w:color="000000"/>
-          <w:insideH w:val="single" w:sz="4" w:color="000000"/>
-          <w:insideV w:val="single" w:sz="4" w:color="000000"/>
+          <w:top w:val="nil"/>
+          <w:left w:val="nil"/>
+          <w:bottom w:val="nil"/>
+          <w:right w:val="nil"/>
+          <w:insideH w:val="nil"/>
+          <w:insideV w:val="nil"/>
         </w:tblBorders>
         <w:tblLayout w:type="fixed"/>
       </w:tblPr>
@@ -651,12 +651,12 @@
         <w:tblLook w:firstRow="1" w:lastRow="0" w:firstColumn="0" w:lastColumn="0" w:noHBand="0" w:noVBand="0" w:val="0020"/>
         <w:jc w:val="start"/>
         <w:tblBorders>
-          <w:top w:val="single" w:sz="4" w:color="000000"/>
-          <w:left w:val="single" w:sz="4" w:color="000000"/>
-          <w:bottom w:val="single" w:sz="4" w:color="000000"/>
-          <w:right w:val="single" w:sz="4" w:color="000000"/>
-          <w:insideH w:val="single" w:sz="4" w:color="000000"/>
-          <w:insideV w:val="single" w:sz="4" w:color="000000"/>
+          <w:top w:val="nil"/>
+          <w:left w:val="nil"/>
+          <w:bottom w:val="nil"/>
+          <w:right w:val="nil"/>
+          <w:insideH w:val="nil"/>
+          <w:insideV w:val="nil"/>
         </w:tblBorders>
         <w:tblLayout w:type="fixed"/>
       </w:tblPr>
@@ -2916,9 +2916,6 @@
       </w:trPr>
       <w:tcPr>
         <w:vAlign w:val="bottom"/>
-        <w:tcBorders>
-          <w:bottom w:val="single"/>
-        </w:tcBorders>
       </w:tcPr>
     </w:tblStylePr>
   </w:style>

</xml_diff>